<commit_message>
v1.1 : HR persona, Chief HR Officer strategic commentary, RAG Q&A mode, folder watcher, deprecation fix, retry logic
</commit_message>
<xml_diff>
--- a/output/sample_briefing.docx
+++ b/output/sample_briefing.docx
@@ -25,7 +25,7 @@
           <w:color w:val="555555"/>
           <w:sz w:val="22"/>
         </w:rPr>
-        <w:t>Prepared May 21, 2026</w:t>
+        <w:t>Prepared May 26, 2026</w:t>
       </w:r>
     </w:p>
     <w:p/>
@@ -37,22 +37,22 @@
         <w:rPr>
           <w:color w:val="1F3A5F"/>
         </w:rPr>
-        <w:t>Overall Attrition Overview</w:t>
+        <w:t>Workforce Composition &amp; Demographics</w:t>
       </w:r>
     </w:p>
     <w:p>
       <w:r>
-        <w:t>Our recent attrition analysis reveals several high-risk segments warranting immediate attention due to their disproportionately high turnover rates. The most critical indicator is employees consistently working overtime, experiencing an alarming 30.5% attrition rate compared to 10.4% for those without overtime. Furthermore, new hires in their first year demonstrate significant vulnerability, with a 34.9% attrition rate within the 0-1 year tenure bucket. Specific job roles also present elevated risk, particularly Sales Representatives at 39.8%, Laboratory Technicians at 23.9%, and employees within the Human Resources job role at 23.1%, closely aligning with the high departmental attrition in Sales (20.6%) and Human Resources (19.0%).</w:t>
+        <w:t>Analysis of our current workforce data reveals a critical need for strategic intervention concerning employee retention and engagement. Out of a total workforce of 1470 employees, we observed a significant attrition rate of 16.1%, representing 237 departures. This level of talent outflow demands immediate strategic attention to mitigate its impact on productivity, institutional knowledge, and operational costs.</w:t>
       </w:r>
     </w:p>
     <w:p>
       <w:r>
-        <w:t>The recurring patterns observed across these segments point to several underlying stressors and areas of vulnerability. The stark disparity in attrition rates based on overtime status strongly suggests potential issues with workload management, work-life balance, and employee burnout, indicating that sustained periods of increased work demands are a primary contributor to employee dissatisfaction and subsequent departure. Similarly, the high attrition among employees in their first year of tenure suggests potential deficiencies in our onboarding processes, initial role fit, or the early career development experience, leading to a significant loss of newly invested talent before full integration. The consistently high attrition within Sales, particularly among Sales Representatives, indicates intense pressure or dissatisfaction potentially related to targets, compensation structures, or career progression within this critical revenue-generating function.</w:t>
+        <w:t>Further examination highlights several interconnected factors impacting overall workforce stability. Average job satisfaction currently stands at 2.73 on a 4-point scale, indicating moderate but suboptimal employee sentiment that warrants improvement. Concurrently, nearly one-third (28.3%) of our employees are consistently working overtime, a factor often correlated with increased burnout and potential attrition risk. While the average tenure stands at 7.0 years, this aggregate figure necessitates deeper segmentation to understand if attrition is concentrated among specific experience cohorts or departments.</w:t>
       </w:r>
     </w:p>
     <w:p>
       <w:r>
-        <w:t>These patterns collectively pose substantial workforce risks, impacting productivity, institutional knowledge, and overall operational stability. The loss of new talent within the first year represents a significant wasted investment in recruitment, onboarding, and training, leading to constant churn and a diminished talent pipeline. High attrition in critical operational roles like Sales Representatives directly threatens revenue generation and market share, while turnover in Human Resources roles undermines our capacity to effectively manage employee relations, talent development, and further retention efforts. Addressing these identified high-risk segments is crucial to mitigating broader organizational vulnerabilities, stabilizing our workforce, and ensuring business continuity.</w:t>
+        <w:t>With the majority of our workforce concentrated in Research &amp; Development (961 employees) and Sales (446 employees), targeted strategies will be essential to address these trends. Proactive measures, encompassing a review of the average monthly income of $6,503 against market benchmarks and a deep dive into departmental specific challenges, will be crucial to mitigate further talent loss and enhance overall organizational effectiveness.</w:t>
       </w:r>
     </w:p>
     <w:p>
@@ -63,17 +63,17 @@
         <w:rPr>
           <w:color w:val="1F3A5F"/>
         </w:rPr>
-        <w:t>Employee Demographics and Distribution</w:t>
+        <w:t>Attrition Trends &amp; Risk Factors</w:t>
       </w:r>
     </w:p>
     <w:p>
       <w:r>
-        <w:t>This executive briefing provides a concise overview of key human capital metrics for our current workforce of 1470 employees. A significant area for immediate attention is the 16.1% attrition rate, with 237 employees departing the organization. Despite this, average employee tenure remains robust at 7.0 years, suggesting a core of long-serving talent, and the average monthly income across the organization stands at $6,503.</w:t>
+        <w:t>Our analysis of recent attrition data identifies several critical segments posing immediate workforce risk. The most striking observation is the disproportionately high attrition among employees consistently working overtime, reaching 30.5% compared to just 10.4% for those not working overtime – nearly a three-fold difference. Concurrently, the Sales Department exhibits the highest departmental attrition at 20.6%, with 'Sales Representative' being the most vulnerable job role at an alarming 39.8% attrition rate. This confluence strongly suggests that high-pressure, potentially under-resourced roles, frequently demanding extensive overtime, are significant drivers of voluntary departures.</w:t>
       </w:r>
     </w:p>
     <w:p>
       <w:r>
-        <w:t>Delving deeper into employee sentiment and workload, the average Job Satisfaction score is reported at 2.73 on a 4-point scale, indicating moderate satisfaction levels that warrant closer examination. Concurrently, 28.3% of the workforce is regularly working overtime, a factor that could influence both satisfaction and productivity if not managed effectively. Our departmental distribution shows a substantial concentration in Research &amp; Development with 961 employees, followed by Sales with 446 employees, and Human Resources supporting operations with 63 employees.</w:t>
+        <w:t>Further examination of the data reveals a critical risk associated with early-tenure employees, where 34.9% of attrition occurs within the first year of employment, diminishing to 18.4% by year three. This rapid early exit, particularly pronounced in critical frontline roles like Sales Representative and Laboratory Technician (23.9%), indicates potential issues with onboarding effectiveness, role clarity, or immediate supervisor support. The cumulative effect of high attrition in these key segments, exacerbated by the overtime dynamic, poses substantial commercial implications: increased recruitment and training costs, diminished productivity, and a tangible threat to revenue generation and market share due to the loss of experienced personnel. This pattern highlights an urgent need for targeted interventions to mitigate financial strain and maintain operational continuity.</w:t>
       </w:r>
     </w:p>
     <w:p>
@@ -84,22 +84,17 @@
         <w:rPr>
           <w:color w:val="1F3A5F"/>
         </w:rPr>
-        <w:t>Performance and Satisfaction Analysis</w:t>
+        <w:t>Employee Experience &amp; Engagement</w:t>
       </w:r>
     </w:p>
     <w:p>
       <w:r>
-        <w:t>Our recent satisfaction data indicates a pervasive challenge across the organization, with all departments demonstrating average scores below 3.0 on a 1-4 scale for Job Satisfaction, Environment Satisfaction, and Work-Life Balance. Notably, Human Resources consistently registers the lowest average Job Satisfaction (2.6) and ties with Sales for the lowest Environment Satisfaction (2.68). Research &amp; Development shows the lowest Work-Life Balance (2.73), a critical indicator for this innovation-centric function. These patterns suggest that satisfaction issues are not isolated to specific pockets but rather span across key operational areas.</w:t>
+        <w:t>Our recent analysis of employee satisfaction metrics identifies specific areas requiring strategic intervention to bolster workforce stability and productivity. A substantial 38.7% of employees report low Job Satisfaction (ratings of 2 or below on a 1-4 scale), indicating a pervasive challenge across the organization. Departmentally, Human Resources presents the lowest average Job Satisfaction at 2.6, and is tied with Sales for the lowest Environment Satisfaction at 2.68. Research &amp; Development demonstrates the lowest average Work-Life Balance at 2.73. These patterns suggest that while general job satisfaction is a material organizational concern, specific departments are contending with distinct underlying drivers impacting critical facets of their employee experience.</w:t>
       </w:r>
     </w:p>
     <w:p>
       <w:r>
-        <w:t>The consistent below-average scores, particularly within critical functions such as HR, R&amp;D, and Sales, signal a broader organizational engagement risk. While each department presents unique drivers of dissatisfaction—from intrinsic job elements in HR to work-life balance in R&amp;D and environmental factors in Sales—the collective trend points to systemic issues impacting employee experience. This widespread dissatisfaction underpins a significant potential for reduced discretionary effort and productivity across the workforce.</w:t>
-      </w:r>
-    </w:p>
-    <w:p>
-      <w:r>
-        <w:t>Further data supports this heightened engagement risk, revealing that a substantial 38.7% of all employees currently report low Job Satisfaction (defined as a score of 2 or less). This group poses a significant attrition risk, as evidenced by their 19.7% attrition rate—a notable increase compared to the 13.9% attrition rate observed among employees with satisfactory scores (3 or higher). Such a disparity underscores a direct correlation between low satisfaction and talent loss, indicating that nearly two-fifths of our workforce are at a considerably higher risk of departure. Addressing these underlying satisfaction drivers will be critical to mitigating talent drain and fostering a more engaged, stable workforce.</w:t>
+        <w:t>This widespread low satisfaction directly correlates with heightened engagement risk and potential attrition. The 38.7% of employees reporting low Job Satisfaction (&lt;=2) exhibit a materially higher attrition rate of 19.7%, compared to 13.9% for their satisfied colleagues (&gt;=3). This 5.8 percentage point differential underscores that low satisfaction is a significant predictor of voluntary turnover and a critical indicator of disengagement. The presence of nearly 40% of our workforce in this high-risk category represents a substantial threat to talent retention, institutional knowledge, and operational continuity. Addressing these satisfaction drivers is a strategic imperative to mitigate escalating costs associated with recruitment, onboarding, and potential productivity loss.</w:t>
       </w:r>
     </w:p>
     <w:p>
@@ -110,27 +105,22 @@
         <w:rPr>
           <w:color w:val="1F3A5F"/>
         </w:rPr>
-        <w:t>Compensation and Career Progression</w:t>
+        <w:t>Performance Management &amp; Career Progression</w:t>
       </w:r>
     </w:p>
     <w:p>
       <w:r>
-        <w:t>**Executive Summary: Workforce Metrics Overview**</w:t>
+        <w:t>An initial review of departmental performance data identifies **Research &amp; Development** as a high-performing and stable segment of the workforce. While average performance ratings across all departments exhibit marginal variance, R&amp;D records the highest average rating at 3.16. More critically, this department demonstrates the lowest attrition rate at 13.8%, substantially below the organizational average. This strong retention, particularly within our largest department (headcount 961), suggests effective talent management and a resilient work environment, even with the lowest average monthly income across the evaluated groups.</w:t>
       </w:r>
     </w:p>
     <w:p>
       <w:r>
-        <w:t>The organization currently comprises a total workforce of 1,470 employees. Over the last reporting period, we observed an attrition rate of 16.1%, with 237 employees departing the company. This rate warrants attention as a key indicator of workforce stability and necessitates a review of our retention strategies and their efficacy.</w:t>
+        <w:t>Conversely, both the **Sales** and **Human Resources** departments warrant closer examination due to elevated attrition rates and specific performance indicators. The Sales department, while reporting the highest average job satisfaction (2.75) and average monthly income ($6,959), paradoxically experiences the highest attrition rate at 20.6%. This unique combination suggests that factors beyond intrinsic satisfaction and direct compensation may be driving talent outflow, such as external market demand for specific skills or the inherent pressures of the role. Human Resources, with the smallest headcount (63), presents a more conventional challenge profile, exhibiting the lowest average job satisfaction (2.6) and an attrition rate of 19.0%, alongside an average performance rating tied for the lowest at 3.14.</w:t>
       </w:r>
     </w:p>
     <w:p>
       <w:r>
-        <w:t>Further analysis reveals an average job satisfaction score of 2.73 on a 1-4 scale, suggesting an opportunity for targeted engagement initiatives to enhance employee experience. The average monthly income across the workforce stands at $6,503, complementing an average employee tenure of 7.0 years. Notably, 28.3% of our employees are consistently working overtime, a factor that may impact job satisfaction and operational efficiency.</w:t>
-      </w:r>
-    </w:p>
-    <w:p>
-      <w:r>
-        <w:t>From a departmental perspective, Research &amp; Development represents the largest segment with 961 employees, followed by Sales with 446 employees, and Human Resources with 63 employees. These figures provide a foundational overview of our current workforce landscape, highlighting areas for strategic focus in talent management, retention, and resource allocation.</w:t>
+        <w:t>The data indicates a nuanced relationship between performance, satisfaction, and attrition across departments. Generally, departments with marginally higher average performance ratings, such as Research &amp; Development, tend to demonstrate stronger talent retention. However, the Sales department stands out as a critical anomaly where high job satisfaction and compensation levels fail to mitigate the highest attrition, pointing to potential external market pressures or internal role demands that require deeper investigation. For Human Resources, the confluence of low job satisfaction, relatively lower performance, and high attrition signals a clear need for targeted intervention to understand and address underlying issues impacting engagement and retention.</w:t>
       </w:r>
     </w:p>
     <w:p>
@@ -141,22 +131,53 @@
         <w:rPr>
           <w:color w:val="1F3A5F"/>
         </w:rPr>
-        <w:t>Key Factors Influencing Attrition</w:t>
+        <w:t>Compensation &amp; Reward Strategy</w:t>
       </w:r>
     </w:p>
     <w:p>
       <w:r>
-        <w:t>Our attrition analysis identifies several critical risk segments demanding immediate attention. Employees working overtime exhibit a significantly elevated attrition rate of 30.5%, nearly triple that of their non-overtime counterparts (10.4%). This points to potential burnout and unsustainable workloads across the organization. Furthermore, new hires in their first year of tenure face a 34.9% attrition rate, highlighting significant challenges in initial retention and integration. Within specific roles, Sales Representatives present the highest individual risk with an alarming 39.8% attrition rate.</w:t>
+        <w:t>This executive summary outlines critical workforce metrics for our organization's total employee base of 1,470. A significant finding is the current attrition rate, with 237 employees, or 16.1% of the workforce, having departed. This level of talent turnover demands immediate strategic attention. Concurrently, the average job satisfaction score across the organization stands at 2.73 on a 4-point scale, indicating a clear opportunity for targeted engagement and retention initiatives.</w:t>
       </w:r>
     </w:p>
     <w:p>
       <w:r>
-        <w:t>These patterns extend to departmental levels, with the Sales department experiencing a 20.6% attrition rate, largely driven by the high turnover among Sales Representatives and Sales Executives (17.5%). This directly impacts revenue generation, client relationships, and necessitates continuous, costly investment in recruitment and training. The Human Resources department also shows a concerning 19.0% attrition, with Human Resources roles specifically reaching 23.1% attrition. Such turnover in a vital support function risks destabilizing internal operations and negatively affecting broader employee experience initiatives. Additionally, Laboratory Technicians demonstrate an elevated attrition rate of 23.9%, potentially impacting specialized project continuity or research output.</w:t>
+        <w:t>Further analysis reveals an average monthly income of $6,503 and an average tenure of 7.0 years within the company. A notable contributing factor to overall workforce dynamics is that 28.3% of employees are regularly working overtime, a statistic often correlated with increased burnout risk and decreased satisfaction. From a structural perspective, the workforce distribution is heavily concentrated in Research &amp; Development with 961 employees, followed by Sales at 446, and Human Resources with 63 employees, necessitating tailored departmental talent strategies.</w:t>
+      </w:r>
+    </w:p>
+    <w:p>
+      <w:pPr>
+        <w:pStyle w:val="Heading1"/>
+      </w:pPr>
+      <w:r>
+        <w:rPr>
+          <w:color w:val="1F3A5F"/>
+        </w:rPr>
+        <w:t>Strategic Executive Commentary</w:t>
       </w:r>
     </w:p>
     <w:p>
       <w:r>
-        <w:t>The confluence of these high-risk indicators—predominantly early tenure employees, those subject to overtime, and critical roles within Sales and Human Resources—signals a significant and multifaceted workforce risk. This extends beyond simple headcount loss, representing a continuous drain on institutional knowledge, increased operational instability due to high churn in key functions, and potentially a broader decline in employee engagement and morale. Addressing these specific segments is paramount to mitigating talent pipeline fragility and ensuring the sustained productivity and stability of our workforce.</w:t>
+        <w:t>To the CEO and Executive Team,</w:t>
+      </w:r>
+    </w:p>
+    <w:p>
+      <w:r>
+        <w:t>Our recent workforce briefing reveals a talent retention crisis that demands immediate executive attention, transcending typical HR metrics to become a critical business performance issue. The single most critical workforce risk on our agenda is the unsustainable attrition driven by employee burnout and inadequate role support, particularly among our frontline and early-tenure employees. With 30.5% attrition among employees consistently working overtime – nearly triple the rate of those not – we are effectively burning out our talent. This is compounded by an alarming 34.9% attrition within the first year of employment and a devastating 39.8% turnover rate for Sales Representatives. This isn't merely a cost problem; it's a direct threat to our revenue generation capacity, market share, and long-term growth objectives. The constant churn in critical roles means perpetually under-resourced teams, missed opportunities, and a significant drain on our operational efficiency.</w:t>
+      </w:r>
+    </w:p>
+    <w:p>
+      <w:r>
+        <w:t>The direct connection between these workforce dynamics and broader business performance is stark. Losing nearly 40% of our Sales Representatives annually compromises our ability to acquire new customers, maintain existing relationships, and meet sales targets, directly impacting our top line. Similarly, the 34.9% early-tenure attrition means we are pouring significant investment into recruiting and training talent that never reaches full productivity, inflating operating expenses and delaying time-to-market for our innovations. This continuous churn erodes institutional knowledge, diminishes our competitive edge by handing skilled talent to competitors, and creates a perception of instability in key customer-facing and product development functions. The paradox in Sales – highest average satisfaction and income, yet highest attrition – suggests either intense external market poaching or an untenable role design, both of which require urgent strategic review to safeguard our talent and market position.</w:t>
+      </w:r>
+    </w:p>
+    <w:p>
+      <w:r>
+        <w:t>For the Board of Directors, the message must be clear: our current talent attrition is an unmitigated business risk to our financial performance and strategic execution. We are facing tangible financial losses from recruitment and training costs, diminished productivity, and, most critically, lost revenue and market opportunities. The 16.1% overall attrition and particularly high rates in critical roles like Sales Representatives are unsustainable for delivering shareholder value and achieving our strategic growth ambitions. This issue is eroding our operational effectiveness, impacting our ability to innovate, and jeopardizing our competitive standing in a tight labor market. Without decisive action, we risk not only increased costs but also a tangible reduction in our capacity to scale and deliver on our business commitments.</w:t>
+      </w:r>
+    </w:p>
+    <w:p>
+      <w:r>
+        <w:t>To mitigate these risks and stabilize our workforce, two strategic talent decisions must be prioritized within the next 12-18 months. First, we must implement a comprehensive workload and capacity management strategy to address the root causes of consistent overtime, especially in high-pressure roles and departments. This includes reviewing staffing models, process efficiencies, and technology enablement to alleviate burnout and retain our experienced personnel. Second, we need to significantly enhance our investment in the early-tenure employee experience, particularly for critical frontline roles like Sales Representatives and Laboratory Technicians. This demands a complete re-evaluation of our onboarding, mentorship, career progression, and immediate supervisory support programs to stem the exodus of talent within their first year and ensure our investment translates into sustained productivity and loyalty. These are not merely HR initiatives; they are critical business imperatives to secure our future performance and competitive advantage.</w:t>
       </w:r>
     </w:p>
     <w:sectPr>

</xml_diff>

<commit_message>
v1.2 - business impact section, README polish, screenshot, audit complete
</commit_message>
<xml_diff>
--- a/output/sample_briefing.docx
+++ b/output/sample_briefing.docx
@@ -25,7 +25,7 @@
           <w:color w:val="555555"/>
           <w:sz w:val="22"/>
         </w:rPr>
-        <w:t>Prepared May 26, 2026</w:t>
+        <w:t>Prepared May 28, 2026</w:t>
       </w:r>
     </w:p>
     <w:p/>
@@ -37,22 +37,22 @@
         <w:rPr>
           <w:color w:val="1F3A5F"/>
         </w:rPr>
-        <w:t>Workforce Composition &amp; Demographics</w:t>
+        <w:t>Strategic Attrition Insights</w:t>
       </w:r>
     </w:p>
     <w:p>
       <w:r>
-        <w:t>Analysis of our current workforce data reveals a critical need for strategic intervention concerning employee retention and engagement. Out of a total workforce of 1470 employees, we observed a significant attrition rate of 16.1%, representing 237 departures. This level of talent outflow demands immediate strategic attention to mitigate its impact on productivity, institutional knowledge, and operational costs.</w:t>
+        <w:t>Attrition analysis reveals several critical segments exhibiting elevated departure rates, signaling significant workforce risk. The most pronounced segment for attrition is employees within their first year of tenure, exhibiting a 34.9% departure rate. This is substantially higher than other tenure buckets, with rates dropping to 18.4% for 2-3 years and consistently declining thereafter. Concurrently, employees regularly working overtime present a notably elevated attrition risk at 30.5%, nearly triple the rate of those not working overtime (10.4%). Furthermore, specific job roles and departments are experiencing acute challenges: Sales Representatives show an alarmingly high 39.8% attrition, followed by Laboratory Technicians at 23.9%, and individuals within Human Resources at 23.1%. The Sales department overall reports the highest departmental attrition at 20.6%, closely followed by Human Resources at 19.0%.</w:t>
       </w:r>
     </w:p>
     <w:p>
       <w:r>
-        <w:t>Further examination highlights several interconnected factors impacting overall workforce stability. Average job satisfaction currently stands at 2.73 on a 4-point scale, indicating moderate but suboptimal employee sentiment that warrants improvement. Concurrently, nearly one-third (28.3%) of our employees are consistently working overtime, a factor often correlated with increased burnout and potential attrition risk. While the average tenure stands at 7.0 years, this aggregate figure necessitates deeper segmentation to understand if attrition is concentrated among specific experience cohorts or departments.</w:t>
+        <w:t>These patterns collectively signal critical underlying issues impacting our talent stability. The high early-tenure attrition suggests potential deficiencies in our onboarding processes, initial role alignment, or the speed at which new hires become integrated and productive. Such early departures represent a significant financial drain from wasted recruitment and training investments. The strong correlation between overtime and attrition points directly to unsustainable workloads, potential burnout, and a compromised work-life balance for a substantial portion of our workforce. This trend is particularly concerning given its widespread impact on morale and the long-term health of our employee base.</w:t>
       </w:r>
     </w:p>
     <w:p>
       <w:r>
-        <w:t>With the majority of our workforce concentrated in Research &amp; Development (961 employees) and Sales (446 employees), targeted strategies will be essential to address these trends. Proactive measures, encompassing a review of the average monthly income of $6,503 against market benchmarks and a deep dive into departmental specific challenges, will be crucial to mitigate further talent loss and enhance overall organizational effectiveness.</w:t>
+        <w:t>The convergence of these high-risk indicators translates into substantial workforce risk, impacting operational stability and strategic objectives. The continuous churn in early-career employees and within critical revenue-generating and support functions like Sales and HR necessitates a constant cycle of backfilling, diverting valuable resources and impeding productivity. Moreover, the high attrition among overtime workers suggests an underlying issue of resource allocation or capacity, risking burnout among remaining staff, decreasing institutional knowledge retention, and potentially impacting overall service quality and product development timelines. Unaddressed, these trends will escalate recruitment costs, strain remaining teams, and compromise the organization’s ability to achieve its growth and innovation targets, demanding immediate, targeted interventions.</w:t>
       </w:r>
     </w:p>
     <w:p>
@@ -63,17 +63,22 @@
         <w:rPr>
           <w:color w:val="1F3A5F"/>
         </w:rPr>
-        <w:t>Attrition Trends &amp; Risk Factors</w:t>
+        <w:t>Compensation &amp; Performance Effectiveness</w:t>
       </w:r>
     </w:p>
     <w:p>
       <w:r>
-        <w:t>Our analysis of recent attrition data identifies several critical segments posing immediate workforce risk. The most striking observation is the disproportionately high attrition among employees consistently working overtime, reaching 30.5% compared to just 10.4% for those not working overtime – nearly a three-fold difference. Concurrently, the Sales Department exhibits the highest departmental attrition at 20.6%, with 'Sales Representative' being the most vulnerable job role at an alarming 39.8% attrition rate. This confluence strongly suggests that high-pressure, potentially under-resourced roles, frequently demanding extensive overtime, are significant drivers of voluntary departures.</w:t>
+        <w:t>### Compensation &amp; Reward Strategy</w:t>
       </w:r>
     </w:p>
     <w:p>
       <w:r>
-        <w:t>Further examination of the data reveals a critical risk associated with early-tenure employees, where 34.9% of attrition occurs within the first year of employment, diminishing to 18.4% by year three. This rapid early exit, particularly pronounced in critical frontline roles like Sales Representative and Laboratory Technician (23.9%), indicates potential issues with onboarding effectiveness, role clarity, or immediate supervisor support. The cumulative effect of high attrition in these key segments, exacerbated by the overtime dynamic, poses substantial commercial implications: increased recruitment and training costs, diminished productivity, and a tangible threat to revenue generation and market share due to the loss of experienced personnel. This pattern highlights an urgent need for targeted interventions to mitigate financial strain and maintain operational continuity.</w:t>
+        <w:t>Analysis of current compensation data reveals notable disparities across departments and job roles, alongside critical inconsistencies in our performance reward mechanisms and potential over-reliance on overtime as an income supplement. Average monthly income varies significantly by department, with Sales leading at \$6,959.0, followed by Human Resources at \$6,655.0, and Research &amp; Development at \$6,281.0, indicating a nearly 10% delta between the highest and lowest paid departments. More pronounced are the pay gaps across job roles: while top-tier managerial and directorial positions such as Managers (\$17,182.0) and Research Directors (\$16,034.0) command high remuneration, critical operational roles like Sales Representatives (\$2,626.0), Laboratory Technicians (\$3,237.0), and Research Scientists (\$3,240.0) fall into the lowest income brackets. This wide disparity, exceeding 500% between the highest and lowest average monthly incomes, poses significant risks to internal equity, employee engagement, and our ability to attract and retain talent in key functions.</w:t>
+      </w:r>
+    </w:p>
+    <w:p>
+      <w:r>
+        <w:t>Furthermore, a concerning inverse relationship exists between compensation and performance. Employees with a Performance Rating of 4 currently earn an average monthly income of \$6,314.0, which is paradoxically lower than the \$6,537.0 average for those with a Performance Rating of 3. This misalignment severely undermines the principles of a meritocratic reward system and could disincentivize high performance. In addition, the data signals that overtime may be serving as an unintended mechanism to bridge perceived pay gaps, with employees working overtime earning a slightly higher average monthly income of \$6,549.0 compared to \$6,485.0 for those who do not. While the difference is modest, it suggests that overtime contributions are actively utilized to boost overall compensation, potentially masking underlying issues with base pay adequacy or the efficacy of our performance-linked reward structures. These findings necessitate an immediate review of our compensation philosophy and its execution to ensure fairness, strategic alignment, and sustained workforce motivation.</w:t>
       </w:r>
     </w:p>
     <w:p>
@@ -84,17 +89,22 @@
         <w:rPr>
           <w:color w:val="1F3A5F"/>
         </w:rPr>
-        <w:t>Employee Experience &amp; Engagement</w:t>
+        <w:t>Employee Experience &amp; Engagement Drivers</w:t>
       </w:r>
     </w:p>
     <w:p>
       <w:r>
-        <w:t>Our recent analysis of employee satisfaction metrics identifies specific areas requiring strategic intervention to bolster workforce stability and productivity. A substantial 38.7% of employees report low Job Satisfaction (ratings of 2 or below on a 1-4 scale), indicating a pervasive challenge across the organization. Departmentally, Human Resources presents the lowest average Job Satisfaction at 2.6, and is tied with Sales for the lowest Environment Satisfaction at 2.68. Research &amp; Development demonstrates the lowest average Work-Life Balance at 2.73. These patterns suggest that while general job satisfaction is a material organizational concern, specific departments are contending with distinct underlying drivers impacting critical facets of their employee experience.</w:t>
+        <w:t>### Satisfaction &amp; Engagement</w:t>
       </w:r>
     </w:p>
     <w:p>
       <w:r>
-        <w:t>This widespread low satisfaction directly correlates with heightened engagement risk and potential attrition. The 38.7% of employees reporting low Job Satisfaction (&lt;=2) exhibit a materially higher attrition rate of 19.7%, compared to 13.9% for their satisfied colleagues (&gt;=3). This 5.8 percentage point differential underscores that low satisfaction is a significant predictor of voluntary turnover and a critical indicator of disengagement. The presence of nearly 40% of our workforce in this high-risk category represents a substantial threat to talent retention, institutional knowledge, and operational continuity. Addressing these satisfaction drivers is a strategic imperative to mitigate escalating costs associated with recruitment, onboarding, and potential productivity loss.</w:t>
+        <w:t>Analysis of the current data reveals critical areas of concern regarding employee satisfaction and engagement. Human Resources emerges as a department experiencing the lowest average Job Satisfaction at 2.6, and ties with Sales for the lowest Environment Satisfaction at 2.68. Concurrently, Research &amp; Development reports the lowest average Work-Life Balance at 2.73. These departmental-level patterns suggest localized stressors impacting distinct facets of the employee experience across key operational areas, indicating that satisfaction challenges are not uniform but rather concentrated in specific functions.</w:t>
+      </w:r>
+    </w:p>
+    <w:p>
+      <w:r>
+        <w:t>A broader organizational perspective highlights a significant engagement risk, with 38.7% of all employees reporting low Job Satisfaction (a score of 2 or less). This substantial segment of the workforce presents a material vulnerability, as evidenced by the direct correlation with attrition. Employees experiencing low satisfaction exhibit a notably higher attrition rate of 19.7%, compared to 13.9% for their satisfied counterparts. This nearly 6-percentage point differential translates into tangible commercial consequences, including increased talent acquisition costs, potential loss of institutional knowledge, and operational disruptions, underscoring the urgent need for targeted interventions to mitigate this pervasive risk.</w:t>
       </w:r>
     </w:p>
     <w:p>
@@ -105,22 +115,17 @@
         <w:rPr>
           <w:color w:val="1F3A5F"/>
         </w:rPr>
-        <w:t>Performance Management &amp; Career Progression</w:t>
+        <w:t>Talent Development &amp; Career Trajectories</w:t>
       </w:r>
     </w:p>
     <w:p>
       <w:r>
-        <w:t>An initial review of departmental performance data identifies **Research &amp; Development** as a high-performing and stable segment of the workforce. While average performance ratings across all departments exhibit marginal variance, R&amp;D records the highest average rating at 3.16. More critically, this department demonstrates the lowest attrition rate at 13.8%, substantially below the organizational average. This strong retention, particularly within our largest department (headcount 961), suggests effective talent management and a resilient work environment, even with the lowest average monthly income across the evaluated groups.</w:t>
+        <w:t>This brief provides a strategic overview of our 1470-employee workforce, highlighting key trends impacting organizational stability and performance. A primary concern is the significant attrition rate, with 237 employees, or 16.1% of our total headcount, departing. This substantial churn coincides with an average Job Satisfaction score of 2.73 on a 1-4 scale, suggesting underlying issues that warrant immediate attention. Further, 28.3% of our workforce consistently reports working overtime, a factor that often correlates with burnout and reduced engagement, potentially contributing to the current attrition figures.</w:t>
       </w:r>
     </w:p>
     <w:p>
       <w:r>
-        <w:t>Conversely, both the **Sales** and **Human Resources** departments warrant closer examination due to elevated attrition rates and specific performance indicators. The Sales department, while reporting the highest average job satisfaction (2.75) and average monthly income ($6,959), paradoxically experiences the highest attrition rate at 20.6%. This unique combination suggests that factors beyond intrinsic satisfaction and direct compensation may be driving talent outflow, such as external market demand for specific skills or the inherent pressures of the role. Human Resources, with the smallest headcount (63), presents a more conventional challenge profile, exhibiting the lowest average job satisfaction (2.6) and an attrition rate of 19.0%, alongside an average performance rating tied for the lowest at 3.14.</w:t>
-      </w:r>
-    </w:p>
-    <w:p>
-      <w:r>
-        <w:t>The data indicates a nuanced relationship between performance, satisfaction, and attrition across departments. Generally, departments with marginally higher average performance ratings, such as Research &amp; Development, tend to demonstrate stronger talent retention. However, the Sales department stands out as a critical anomaly where high job satisfaction and compensation levels fail to mitigate the highest attrition, pointing to potential external market pressures or internal role demands that require deeper investigation. For Human Resources, the confluence of low job satisfaction, relatively lower performance, and high attrition signals a clear need for targeted intervention to understand and address underlying issues impacting engagement and retention.</w:t>
+        <w:t>Our workforce maintains an average tenure of 7.0 years, indicating a core of long-serving employees. However, this stability needs to be reconciled with the elevated attrition. The average monthly income stands at $6,503. Departmentally, the majority of our employees are concentrated in Research &amp; Development (961 employees) and Sales (446 employees), with Human Resources comprising 63 employees. Given these distributions, a focused analysis of attrition drivers and satisfaction levels within these strategic functions is critical to mitigate further loss and uphold operational effectiveness and commercial objectives.</w:t>
       </w:r>
     </w:p>
     <w:p>
@@ -131,17 +136,22 @@
         <w:rPr>
           <w:color w:val="1F3A5F"/>
         </w:rPr>
-        <w:t>Compensation &amp; Reward Strategy</w:t>
+        <w:t>Workforce Segmentation &amp; Diversity</w:t>
       </w:r>
     </w:p>
     <w:p>
       <w:r>
-        <w:t>This executive summary outlines critical workforce metrics for our organization's total employee base of 1,470. A significant finding is the current attrition rate, with 237 employees, or 16.1% of the workforce, having departed. This level of talent turnover demands immediate strategic attention. Concurrently, the average job satisfaction score across the organization stands at 2.73 on a 4-point scale, indicating a clear opportunity for targeted engagement and retention initiatives.</w:t>
+        <w:t>This executive summary outlines key insights into our current workforce standing, based on data from our 1470 total employees. A significant challenge identified is the annualized attrition rate of 16.1%, representing 237 employees departing the organization. This trend is corroborated by an average Job Satisfaction score of 2.73 on a 4-point scale, indicating moderate employee contentment that warrants immediate strategic attention as a potential driver of talent outflow.</w:t>
       </w:r>
     </w:p>
     <w:p>
       <w:r>
-        <w:t>Further analysis reveals an average monthly income of $6,503 and an average tenure of 7.0 years within the company. A notable contributing factor to overall workforce dynamics is that 28.3% of employees are regularly working overtime, a statistic often correlated with increased burnout risk and decreased satisfaction. From a structural perspective, the workforce distribution is heavily concentrated in Research &amp; Development with 961 employees, followed by Sales at 446, and Human Resources with 63 employees, necessitating tailored departmental talent strategies.</w:t>
+        <w:t>Further analysis reveals that 28.3% of the workforce is consistently working overtime, a factor often associated with elevated stress and reduced engagement levels. While the average monthly income stands at $6,503, and average employee tenure is a robust 7.0 years, these figures suggest a need to differentiate retention strategies, particularly given the active exit rate. The workforce is predominantly distributed across key functions, with Research &amp; Development comprising 961 employees, Sales 446 employees, and Human Resources 63 employees, indicating where the majority of talent and potential impact lies.</w:t>
+      </w:r>
+    </w:p>
+    <w:p>
+      <w:r>
+        <w:t>These aggregated metrics underscore a critical need for strategic workforce interventions aimed at enhancing retention and optimizing the overall employee experience. The current attrition rate of 16.1%, coupled with moderate job satisfaction and significant overtime prevalence, poses a tangible risk to operational continuity, knowledge transfer, and the health of our talent pipeline. Proactive and targeted measures are essential to mitigate these trends and safeguard sustainable organizational performance, particularly within our largest and most critical departments.</w:t>
       </w:r>
     </w:p>
     <w:p>
@@ -157,27 +167,17 @@
     </w:p>
     <w:p>
       <w:r>
-        <w:t>To the CEO and Executive Team,</w:t>
+        <w:t>This workforce briefing reveals a critical threat to our operational stability and future competitiveness that demands immediate CEO-level attention. The single most critical risk is the systemic failure to adequately value and retain our early-career and front-line talent, particularly within revenue-generating and foundational operational roles. With 34.9% of employees departing in their first year and an alarming 39.8% attrition among Sales Representatives, our talent pipeline is hemorrhaging at its entry points and in critical customer-facing functions. This is compounded by the fact that employees regularly working overtime, representing 28.3% of our workforce, exhibit a 30.5% attrition rate—nearly triple that of their peers. This confluence signals a fundamental disconnect in our employee value proposition, leading to unsustainable churn that directly impacts our ability to execute on current business objectives and capture future market share.</w:t>
       </w:r>
     </w:p>
     <w:p>
       <w:r>
-        <w:t>Our recent workforce briefing reveals a talent retention crisis that demands immediate executive attention, transcending typical HR metrics to become a critical business performance issue. The single most critical workforce risk on our agenda is the unsustainable attrition driven by employee burnout and inadequate role support, particularly among our frontline and early-tenure employees. With 30.5% attrition among employees consistently working overtime – nearly triple the rate of those not – we are effectively burning out our talent. This is compounded by an alarming 34.9% attrition within the first year of employment and a devastating 39.8% turnover rate for Sales Representatives. This isn't merely a cost problem; it's a direct threat to our revenue generation capacity, market share, and long-term growth objectives. The constant churn in critical roles means perpetually under-resourced teams, missed opportunities, and a significant drain on our operational efficiency.</w:t>
+        <w:t>This isn't merely an HR problem; it's a direct impediment to broader business performance and our competitive position. The overall 16.1% attrition rate translates into significant financial leakage from constant recruitment, onboarding, and lost productivity, directly eroding our profit margins. Our inability to retain new talent and core operational roles like Sales Representatives and Laboratory Technicians (23.9% attrition) means we are constantly rebuilding, diverting valuable resources from innovation and growth initiatives. Furthermore, the inverse relationship between compensation and performance—where employees with a Performance Rating of 4 earn less than those with a 3—actively disincentivizes our highest contributors, weakening our meritocratic culture and making us vulnerable to losing top talent to competitors who offer clearer pathways to reward. With 38.7% of our employees reporting low job satisfaction, our brand as an employer is at risk, impacting our ability to attract new talent in an increasingly competitive labor market.</w:t>
       </w:r>
     </w:p>
     <w:p>
       <w:r>
-        <w:t>The direct connection between these workforce dynamics and broader business performance is stark. Losing nearly 40% of our Sales Representatives annually compromises our ability to acquire new customers, maintain existing relationships, and meet sales targets, directly impacting our top line. Similarly, the 34.9% early-tenure attrition means we are pouring significant investment into recruiting and training talent that never reaches full productivity, inflating operating expenses and delaying time-to-market for our innovations. This continuous churn erodes institutional knowledge, diminishes our competitive edge by handing skilled talent to competitors, and creates a perception of instability in key customer-facing and product development functions. The paradox in Sales – highest average satisfaction and income, yet highest attrition – suggests either intense external market poaching or an untenable role design, both of which require urgent strategic review to safeguard our talent and market position.</w:t>
-      </w:r>
-    </w:p>
-    <w:p>
-      <w:r>
-        <w:t>For the Board of Directors, the message must be clear: our current talent attrition is an unmitigated business risk to our financial performance and strategic execution. We are facing tangible financial losses from recruitment and training costs, diminished productivity, and, most critically, lost revenue and market opportunities. The 16.1% overall attrition and particularly high rates in critical roles like Sales Representatives are unsustainable for delivering shareholder value and achieving our strategic growth ambitions. This issue is eroding our operational effectiveness, impacting our ability to innovate, and jeopardizing our competitive standing in a tight labor market. Without decisive action, we risk not only increased costs but also a tangible reduction in our capacity to scale and deliver on our business commitments.</w:t>
-      </w:r>
-    </w:p>
-    <w:p>
-      <w:r>
-        <w:t>To mitigate these risks and stabilize our workforce, two strategic talent decisions must be prioritized within the next 12-18 months. First, we must implement a comprehensive workload and capacity management strategy to address the root causes of consistent overtime, especially in high-pressure roles and departments. This includes reviewing staffing models, process efficiencies, and technology enablement to alleviate burnout and retain our experienced personnel. Second, we need to significantly enhance our investment in the early-tenure employee experience, particularly for critical frontline roles like Sales Representatives and Laboratory Technicians. This demands a complete re-evaluation of our onboarding, mentorship, career progression, and immediate supervisory support programs to stem the exodus of talent within their first year and ensure our investment translates into sustained productivity and loyalty. These are not merely HR initiatives; they are critical business imperatives to secure our future performance and competitive advantage.</w:t>
+        <w:t>For the Board of Directors, the message is clear: our current talent strategy poses a material risk to enterprise value and long-term shareholder return. The high attrition in critical functions, fueled by unsustainable workloads and misaligned compensation, directly compromises our capacity to meet sales targets, deliver new products, and maintain operational excellence. This threatens our growth trajectory and our ability to capitalize on market opportunities. To mitigate these risks and safeguard our future, we must make two strategic talent decisions in the next 12-18 months. First, we must launch a comprehensive overhaul of our total rewards strategy, specifically addressing the egregious pay disparities (exceeding 500% between lowest and highest paid roles) and the inverse performance-pay correlation. This means ensuring competitive base salaries for critical operational roles like Sales Representatives and Laboratory Technicians, coupled with a performance management system that genuinely recognizes and rewards high achievement. Second, we must implement a targeted retention strategy focused on early-career talent and workload management, particularly for the 28.3% of employees working significant overtime, to stem the 34.9% first-year attrition and prevent burnout, ensuring we build a stable, engaged, and productive workforce for the long term.</w:t>
       </w:r>
     </w:p>
     <w:sectPr>

</xml_diff>

<commit_message>
v1.2 - graceful quota error handling, README preview screenshot updated, clean end-to-end run verified
</commit_message>
<xml_diff>
--- a/output/sample_briefing.docx
+++ b/output/sample_briefing.docx
@@ -25,9 +25,148 @@
           <w:color w:val="555555"/>
           <w:sz w:val="22"/>
         </w:rPr>
-        <w:t>Prepared May 28, 2026</w:t>
+        <w:t>Prepared May 29, 2026</w:t>
       </w:r>
     </w:p>
+    <w:p/>
+    <w:p>
+      <w:pPr>
+        <w:pStyle w:val="Heading2"/>
+      </w:pPr>
+      <w:r>
+        <w:rPr>
+          <w:color w:val="1F3A5F"/>
+        </w:rPr>
+        <w:t>Key Workforce Metrics</w:t>
+      </w:r>
+    </w:p>
+    <w:tbl>
+      <w:tblPr>
+        <w:tblStyle w:val="TableGrid"/>
+        <w:tblW w:type="auto" w:w="0"/>
+        <w:tblLook w:firstColumn="1" w:firstRow="1" w:lastColumn="0" w:lastRow="0" w:noHBand="0" w:noVBand="1" w:val="04A0"/>
+      </w:tblPr>
+      <w:tblGrid>
+        <w:gridCol w:w="4320"/>
+        <w:gridCol w:w="4320"/>
+      </w:tblGrid>
+      <w:tr>
+        <w:tc>
+          <w:tcPr>
+            <w:tcW w:type="dxa" w:w="4320"/>
+          </w:tcPr>
+          <w:p>
+            <w:r>
+              <w:rPr>
+                <w:b/>
+              </w:rPr>
+              <w:t>Metric</w:t>
+            </w:r>
+          </w:p>
+        </w:tc>
+        <w:tc>
+          <w:tcPr>
+            <w:tcW w:type="dxa" w:w="4320"/>
+          </w:tcPr>
+          <w:p>
+            <w:r>
+              <w:rPr>
+                <w:b/>
+              </w:rPr>
+              <w:t>Value</w:t>
+            </w:r>
+          </w:p>
+        </w:tc>
+      </w:tr>
+      <w:tr>
+        <w:tc>
+          <w:tcPr>
+            <w:tcW w:type="dxa" w:w="4320"/>
+          </w:tcPr>
+          <w:p>
+            <w:r>
+              <w:t>Total Headcount</w:t>
+            </w:r>
+          </w:p>
+        </w:tc>
+        <w:tc>
+          <w:tcPr>
+            <w:tcW w:type="dxa" w:w="4320"/>
+          </w:tcPr>
+          <w:p>
+            <w:r>
+              <w:t>1,470</w:t>
+            </w:r>
+          </w:p>
+        </w:tc>
+      </w:tr>
+      <w:tr>
+        <w:tc>
+          <w:tcPr>
+            <w:tcW w:type="dxa" w:w="4320"/>
+          </w:tcPr>
+          <w:p>
+            <w:r>
+              <w:t>Overall Attrition Rate</w:t>
+            </w:r>
+          </w:p>
+        </w:tc>
+        <w:tc>
+          <w:tcPr>
+            <w:tcW w:type="dxa" w:w="4320"/>
+          </w:tcPr>
+          <w:p>
+            <w:r>
+              <w:t>16.1%</w:t>
+            </w:r>
+          </w:p>
+        </w:tc>
+      </w:tr>
+      <w:tr>
+        <w:tc>
+          <w:tcPr>
+            <w:tcW w:type="dxa" w:w="4320"/>
+          </w:tcPr>
+          <w:p>
+            <w:r>
+              <w:t>Average Job Satisfaction</w:t>
+            </w:r>
+          </w:p>
+        </w:tc>
+        <w:tc>
+          <w:tcPr>
+            <w:tcW w:type="dxa" w:w="4320"/>
+          </w:tcPr>
+          <w:p>
+            <w:r>
+              <w:t>2.7 / 4</w:t>
+            </w:r>
+          </w:p>
+        </w:tc>
+      </w:tr>
+      <w:tr>
+        <w:tc>
+          <w:tcPr>
+            <w:tcW w:type="dxa" w:w="4320"/>
+          </w:tcPr>
+          <w:p>
+            <w:r>
+              <w:t>Employees on Overtime</w:t>
+            </w:r>
+          </w:p>
+        </w:tc>
+        <w:tc>
+          <w:tcPr>
+            <w:tcW w:type="dxa" w:w="4320"/>
+          </w:tcPr>
+          <w:p>
+            <w:r>
+              <w:t>28.3%</w:t>
+            </w:r>
+          </w:p>
+        </w:tc>
+      </w:tr>
+    </w:tbl>
     <w:p/>
     <w:p>
       <w:pPr>
@@ -37,23 +176,25 @@
         <w:rPr>
           <w:color w:val="1F3A5F"/>
         </w:rPr>
-        <w:t>Strategic Attrition Insights</w:t>
+        <w:t>Workforce Attrition Trends &amp; Drivers</w:t>
       </w:r>
     </w:p>
     <w:p>
       <w:r>
-        <w:t>Attrition analysis reveals several critical segments exhibiting elevated departure rates, signaling significant workforce risk. The most pronounced segment for attrition is employees within their first year of tenure, exhibiting a 34.9% departure rate. This is substantially higher than other tenure buckets, with rates dropping to 18.4% for 2-3 years and consistently declining thereafter. Concurrently, employees regularly working overtime present a notably elevated attrition risk at 30.5%, nearly triple the rate of those not working overtime (10.4%). Furthermore, specific job roles and departments are experiencing acute challenges: Sales Representatives show an alarmingly high 39.8% attrition, followed by Laboratory Technicians at 23.9%, and individuals within Human Resources at 23.1%. The Sales department overall reports the highest departmental attrition at 20.6%, closely followed by Human Resources at 19.0%.</w:t>
+        <w:t>The data reveals several critical attrition hotspots and underlying patterns requiring immediate strategic attention. The most pronounced risk lies within our early-tenure population, with a staggering 34.9% attrition rate in the first year of employment, indicating potential challenges in onboarding, role integration, or initial job satisfaction. Concurrently, specific roles within the Sales department, particularly Sales Representatives (39.8%) and Sales Executives (17.5%), are experiencing disproportionately high turnover, driving the department's overall 20.6% attrition rate. This trend extends to our Human Resources department, which registers a 19.0% departmental attrition rate and a 23.1% rate for HR-specific roles. A significant contributing factor across segments is the impact of overtime: employees consistently working overtime are nearly three times more likely to depart (30.5% vs. 10.4% for those not working overtime), pointing to workload and potential burnout as major drivers.</w:t>
       </w:r>
     </w:p>
     <w:p>
       <w:r>
-        <w:t>These patterns collectively signal critical underlying issues impacting our talent stability. The high early-tenure attrition suggests potential deficiencies in our onboarding processes, initial role alignment, or the speed at which new hires become integrated and productive. Such early departures represent a significant financial drain from wasted recruitment and training investments. The strong correlation between overtime and attrition points directly to unsustainable workloads, potential burnout, and a compromised work-life balance for a substantial portion of our workforce. This trend is particularly concerning given its widespread impact on morale and the long-term health of our employee base.</w:t>
+        <w:t>These patterns present considerable workforce risks impacting both operational continuity and strategic objectives. The high early-tenure attrition represents a substantial drain on recruitment and training investments, yielding minimal return on talent acquisition efforts and consistently depleting entry-level pipelines. The elevated turnover in Sales roles directly threatens revenue generation, market share, and client relationships, while the attrition within HR jeopardizes our ability to effectively manage talent, maintain employee experience, and support critical business functions. The strong correlation between overtime and attrition underscores a systemic issue of unsustainable workloads, which, if unaddressed, will continue to erode employee engagement, productivity, and overall organizational resilience, leading to increased costs and diminished performance.</w:t>
       </w:r>
     </w:p>
     <w:p>
-      <w:r>
-        <w:t>The convergence of these high-risk indicators translates into substantial workforce risk, impacting operational stability and strategic objectives. The continuous churn in early-career employees and within critical revenue-generating and support functions like Sales and HR necessitates a constant cycle of backfilling, diverting valuable resources and impeding productivity. Moreover, the high attrition among overtime workers suggests an underlying issue of resource allocation or capacity, risking burnout among remaining staff, decreasing institutional knowledge retention, and potentially impacting overall service quality and product development timelines. Unaddressed, these trends will escalate recruitment costs, strain remaining teams, and compromise the organization’s ability to achieve its growth and innovation targets, demanding immediate, targeted interventions.</w:t>
-      </w:r>
+      <w:pPr>
+        <w:pBdr>
+          <w:bottom w:val="single" w:sz="6" w:space="1" w:color="1F3A5F"/>
+        </w:pBdr>
+      </w:pPr>
     </w:p>
     <w:p>
       <w:pPr>
@@ -63,23 +204,30 @@
         <w:rPr>
           <w:color w:val="1F3A5F"/>
         </w:rPr>
-        <w:t>Compensation &amp; Performance Effectiveness</w:t>
+        <w:t>Compensation &amp; Performance Dynamics</w:t>
       </w:r>
     </w:p>
     <w:p>
       <w:r>
-        <w:t>### Compensation &amp; Reward Strategy</w:t>
+        <w:t>Compensation &amp; Reward Strategy Analysis</w:t>
       </w:r>
     </w:p>
     <w:p>
       <w:r>
-        <w:t>Analysis of current compensation data reveals notable disparities across departments and job roles, alongside critical inconsistencies in our performance reward mechanisms and potential over-reliance on overtime as an income supplement. Average monthly income varies significantly by department, with Sales leading at \$6,959.0, followed by Human Resources at \$6,655.0, and Research &amp; Development at \$6,281.0, indicating a nearly 10% delta between the highest and lowest paid departments. More pronounced are the pay gaps across job roles: while top-tier managerial and directorial positions such as Managers (\$17,182.0) and Research Directors (\$16,034.0) command high remuneration, critical operational roles like Sales Representatives (\$2,626.0), Laboratory Technicians (\$3,237.0), and Research Scientists (\$3,240.0) fall into the lowest income brackets. This wide disparity, exceeding 500% between the highest and lowest average monthly incomes, poses significant risks to internal equity, employee engagement, and our ability to attract and retain talent in key functions.</w:t>
+        <w:t>An initial review of compensation data reveals notable disparities across departments and job roles, alongside critical insights into the relationship between pay, performance, and overtime utilization. Average monthly income varies significantly by department, with Sales leading at $6959.0, followed by Human Resources at $6655.0, and Research &amp; Development at $6281.0. This $678.0 difference between the highest and lowest paying departments merits attention for resource allocation and market competitiveness. More pronounced are the pay gaps across job roles: while top positions like Manager command an average monthly income of $17182.0 and Research Director $16034.0, roles such as Manufacturing Director average $7295.0, and Sales Executive $6924.0. Conversely, lower-tier roles present significant disparities, with Research Scientist averaging $3240.0, Laboratory Technician $3237.0, and Sales Representative earning an average of $2626.0. The Human Resources job role also presents a notable concern, averaging only $4236.0, which is substantially below the departmental average for HR, suggesting potential internal equity issues or an under-evaluation of certain functional roles within the current structure. These wide variances suggest a need for a comprehensive job evaluation and leveling exercise to ensure internal equity and external competitiveness across the organizational structure.</w:t>
       </w:r>
     </w:p>
     <w:p>
       <w:r>
-        <w:t>Furthermore, a concerning inverse relationship exists between compensation and performance. Employees with a Performance Rating of 4 currently earn an average monthly income of \$6,314.0, which is paradoxically lower than the \$6,537.0 average for those with a Performance Rating of 3. This misalignment severely undermines the principles of a meritocratic reward system and could disincentivize high performance. In addition, the data signals that overtime may be serving as an unintended mechanism to bridge perceived pay gaps, with employees working overtime earning a slightly higher average monthly income of \$6,549.0 compared to \$6,485.0 for those who do not. While the difference is modest, it suggests that overtime contributions are actively utilized to boost overall compensation, potentially masking underlying issues with base pay adequacy or the efficacy of our performance-linked reward structures. These findings necessitate an immediate review of our compensation philosophy and its execution to ensure fairness, strategic alignment, and sustained workforce motivation.</w:t>
+        <w:t>Furthermore, the data indicates a critical disconnect between performance and compensation outcomes. Employees with a Performance Rating of 3 report an average monthly income of $6537.0, which is counter-intuitively higher than the $6314.0 average for employees with the highest Performance Rating of 4. This finding suggests that our current compensation structure may not effectively differentiate or adequately reward top performers, potentially impacting motivation and retention among our highest-contributing individuals. Concurrently, an analysis of overtime usage reveals that employees working overtime earn an average of $6549.0, marginally more than the $6485.0 earned by those who do not. While this $64.0 difference may appear small, it could signal that overtime is being utilized by employees as a mechanism to supplement base compensation, potentially compensating for perceived pay gaps or insufficient foundational salaries. This pattern warrants deeper investigation into the underlying drivers of overtime usage and its implications for overall reward strategy effectiveness and employee engagement.</w:t>
       </w:r>
+    </w:p>
+    <w:p>
+      <w:pPr>
+        <w:pBdr>
+          <w:bottom w:val="single" w:sz="6" w:space="1" w:color="1F3A5F"/>
+        </w:pBdr>
+      </w:pPr>
     </w:p>
     <w:p>
       <w:pPr>
@@ -89,23 +237,30 @@
         <w:rPr>
           <w:color w:val="1F3A5F"/>
         </w:rPr>
-        <w:t>Employee Experience &amp; Engagement Drivers</w:t>
+        <w:t>Employee Well-being &amp; Engagement Landscape</w:t>
       </w:r>
     </w:p>
     <w:p>
       <w:r>
-        <w:t>### Satisfaction &amp; Engagement</w:t>
+        <w:t>The data reveals a significant and widespread challenge concerning employee satisfaction within the organization. A critical indicator is that 38.7% of employees report low Job Satisfaction (scoring &lt;=2), highlighting a substantial segment of the workforce experiencing foundational discontent. Departmentally, Human Resources demonstrates the lowest Job Satisfaction (2.6) and shares the lowest Environment Satisfaction (2.68) with Sales. Research &amp; Development exhibits the most pronounced struggle with Work-Life Balance (2.73). Notably, average satisfaction scores across all departments for Job, Environment, and Work-Life Balance consistently fall below the optimal threshold of 3, indicating that dissatisfaction is not confined to isolated pockets but is a more pervasive issue.</w:t>
       </w:r>
     </w:p>
     <w:p>
       <w:r>
-        <w:t>Analysis of the current data reveals critical areas of concern regarding employee satisfaction and engagement. Human Resources emerges as a department experiencing the lowest average Job Satisfaction at 2.6, and ties with Sales for the lowest Environment Satisfaction at 2.68. Concurrently, Research &amp; Development reports the lowest average Work-Life Balance at 2.73. These departmental-level patterns suggest localized stressors impacting distinct facets of the employee experience across key operational areas, indicating that satisfaction challenges are not uniform but rather concentrated in specific functions.</w:t>
+        <w:t>A clear pattern emerges from these metrics: satisfaction levels are generally suboptimal across the organization, rather than being concentrated in a single department or dimension. This widespread moderate to low satisfaction suggests systemic factors are at play, influencing the overall employee experience. Critically, the data substantiates a direct correlation between low satisfaction and increased attrition. Employees reporting low satisfaction exhibit an attrition rate of 19.7%, a stark contrast to the 13.9% observed among their satisfied counterparts. This 5.8 percentage point differential underscores the tangible impact of dissatisfaction on talent retention.</w:t>
       </w:r>
     </w:p>
     <w:p>
       <w:r>
-        <w:t>A broader organizational perspective highlights a significant engagement risk, with 38.7% of all employees reporting low Job Satisfaction (a score of 2 or less). This substantial segment of the workforce presents a material vulnerability, as evidenced by the direct correlation with attrition. Employees experiencing low satisfaction exhibit a notably higher attrition rate of 19.7%, compared to 13.9% for their satisfied counterparts. This nearly 6-percentage point differential translates into tangible commercial consequences, including increased talent acquisition costs, potential loss of institutional knowledge, and operational disruptions, underscoring the urgent need for targeted interventions to mitigate this pervasive risk.</w:t>
+        <w:t>The confluence of these factors points to a significant organizational engagement risk. With nearly two-fifths of the workforce experiencing low job satisfaction and demonstrating a higher propensity for attrition, the organization faces potential talent drain, diminished productivity, and adverse impacts on institutional knowledge. The consistently sub-optimal scores across all key satisfaction dimensions suggest a broader systemic challenge that, if unaddressed, could compromise workforce stability and impede strategic objectives. A proactive and comprehensive strategy is imperative to mitigate this risk and foster a more engaged and resilient workforce.</w:t>
       </w:r>
+    </w:p>
+    <w:p>
+      <w:pPr>
+        <w:pBdr>
+          <w:bottom w:val="single" w:sz="6" w:space="1" w:color="1F3A5F"/>
+        </w:pBdr>
+      </w:pPr>
     </w:p>
     <w:p>
       <w:pPr>
@@ -115,18 +270,30 @@
         <w:rPr>
           <w:color w:val="1F3A5F"/>
         </w:rPr>
-        <w:t>Talent Development &amp; Career Trajectories</w:t>
+        <w:t>Talent Tenure &amp; Career Progression</w:t>
       </w:r>
     </w:p>
     <w:p>
       <w:r>
-        <w:t>This brief provides a strategic overview of our 1470-employee workforce, highlighting key trends impacting organizational stability and performance. A primary concern is the significant attrition rate, with 237 employees, or 16.1% of our total headcount, departing. This substantial churn coincides with an average Job Satisfaction score of 2.73 on a 1-4 scale, suggesting underlying issues that warrant immediate attention. Further, 28.3% of our workforce consistently reports working overtime, a factor that often correlates with burnout and reduced engagement, potentially contributing to the current attrition figures.</w:t>
+        <w:t>Analysis of departmental performance data reveals largely consistent average performance ratings across the organization, with Research &amp; Development, Sales, and Human Resources all achieving average scores between 3.14 and 3.16 on a 4-point scale. This negligible variation suggests a baseline level of performance consistency, making other metrics more critical in identifying areas of strength and concern regarding overall departmental health and stability.</w:t>
       </w:r>
     </w:p>
     <w:p>
       <w:r>
-        <w:t>Our workforce maintains an average tenure of 7.0 years, indicating a core of long-serving employees. However, this stability needs to be reconciled with the elevated attrition. The average monthly income stands at $6,503. Departmentally, the majority of our employees are concentrated in Research &amp; Development (961 employees) and Sales (446 employees), with Human Resources comprising 63 employees. Given these distributions, a focused analysis of attrition drivers and satisfaction levels within these strategic functions is critical to mitigate further loss and uphold operational effectiveness and commercial objectives.</w:t>
+        <w:t>A more distinct picture emerges when examining attrition and job satisfaction. The Research &amp; Development department demonstrates strong stability, exhibiting the lowest attrition rate at 13.8% and the highest average performance rating (3.16), coupled with a robust job satisfaction score of 2.73. Conversely, the Sales department presents a critical area for review, recording the highest attrition rate at 20.6%. This is a noteworthy dynamic given that Sales also reports the highest average job satisfaction at 2.75. This counter-intuitive correlation between high satisfaction and high attrition in Sales merits further investigation into potential external market pressures, compensation competitiveness, or role-specific demands that may override internal satisfaction drivers for retention. The Human Resources department, with an average performance rating identical to Sales (3.14), faces challenges with the lowest average job satisfaction score (2.6) and the second-highest attrition rate (19.0%), indicating potential internal morale or workload pressures that warrant immediate attention.</w:t>
       </w:r>
+    </w:p>
+    <w:p>
+      <w:r>
+        <w:t>Based on this data, while average performance ratings show no significant direct correlation with either attrition or satisfaction across departments, the interplay between job satisfaction and attrition is evident. R&amp;D's combination of higher satisfaction and lowest attrition suggests a healthy environment, whereas HR's lower satisfaction correlating with higher attrition aligns with conventional expectations. The Sales department's high satisfaction alongside its highest attrition rate highlights a complex issue demanding a more granular analysis beyond internal sentiment. This dataset suggests that factors beyond individual performance ratings are the primary drivers of talent retention and departmental stability.</w:t>
+      </w:r>
+    </w:p>
+    <w:p>
+      <w:pPr>
+        <w:pBdr>
+          <w:bottom w:val="single" w:sz="6" w:space="1" w:color="1F3A5F"/>
+        </w:pBdr>
+      </w:pPr>
     </w:p>
     <w:p>
       <w:pPr>
@@ -136,23 +303,30 @@
         <w:rPr>
           <w:color w:val="1F3A5F"/>
         </w:rPr>
-        <w:t>Workforce Segmentation &amp; Diversity</w:t>
+        <w:t>Organizational Demographics &amp; Departmental Profiles</w:t>
       </w:r>
     </w:p>
     <w:p>
       <w:r>
-        <w:t>This executive summary outlines key insights into our current workforce standing, based on data from our 1470 total employees. A significant challenge identified is the annualized attrition rate of 16.1%, representing 237 employees departing the organization. This trend is corroborated by an average Job Satisfaction score of 2.73 on a 4-point scale, indicating moderate employee contentment that warrants immediate strategic attention as a potential driver of talent outflow.</w:t>
+        <w:t>Demographic &amp; Organizational Insights</w:t>
       </w:r>
     </w:p>
     <w:p>
       <w:r>
-        <w:t>Further analysis reveals that 28.3% of the workforce is consistently working overtime, a factor often associated with elevated stress and reduced engagement levels. While the average monthly income stands at $6,503, and average employee tenure is a robust 7.0 years, these figures suggest a need to differentiate retention strategies, particularly given the active exit rate. The workforce is predominantly distributed across key functions, with Research &amp; Development comprising 961 employees, Sales 446 employees, and Human Resources 63 employees, indicating where the majority of talent and potential impact lies.</w:t>
+        <w:t>The organization's current workforce comprises 1,470 employees, exhibiting distinct demographic characteristics critical for strategic workforce planning. Age distribution reveals a significant concentration within the 30-40 bracket, representing 679 employees. Combined with the 'Under 30' cohort of 326, nearly 70% of the workforce (1,005 employees) is under 40 years old, while the 'Over 50' segment is considerably smaller at 143 employees. This profile signals a potential mid-career bulge requiring focused attention on career progression pathways, leadership development, and strategic knowledge transfer initiatives to mitigate future experience gaps. The gender split indicates a notable imbalance, with 882 male employees compared to 588 female employees. This approximately 3:2 male-to-female ratio highlights an imperative for robust Diversity, Equity, and Inclusion (DEI) strategies to attract and retain a more balanced talent pool. Furthermore, marital status data shows 673 married employees, 470 single, and 327 divorced, providing context for considerations regarding benefits packages and work-life balance programs tailored to varying employee needs.</w:t>
       </w:r>
     </w:p>
     <w:p>
       <w:r>
-        <w:t>These aggregated metrics underscore a critical need for strategic workforce interventions aimed at enhancing retention and optimizing the overall employee experience. The current attrition rate of 16.1%, coupled with moderate job satisfaction and significant overtime prevalence, poses a tangible risk to operational continuity, knowledge transfer, and the health of our talent pipeline. Proactive and targeted measures are essential to mitigate these trends and safeguard sustainable organizational performance, particularly within our largest and most critical departments.</w:t>
+        <w:t>From an educational and departmental perspective, the workforce demonstrates a high-skilled foundation with pronounced structural concentrations. The majority hold a Bachelor's degree (572 employees) or a Master's degree (398 employees), suggesting a workforce capable of tackling complex challenges; workforce development initiatives should align with advancing these existing capabilities. Organizationally, there is an extreme concentration of talent within Research &amp; Development, which accounts for 961 employees, or approximately 65% of the total workforce. Sales employs 446 individuals, while Human Resources operates as a significantly leaner function with only 63 employees. This departmental structure implies that workforce planning must heavily prioritize R&amp;D talent pipelines, critical skill development, and retention strategies to sustain innovation. Furthermore, the lean HR function warrants an assessment of its capacity to deliver comprehensive strategic support and scale effectively with future organizational growth initiatives, particularly given the large R&amp;D cohort's needs.</w:t>
       </w:r>
+    </w:p>
+    <w:p>
+      <w:pPr>
+        <w:pBdr>
+          <w:bottom w:val="single" w:sz="6" w:space="1" w:color="1F3A5F"/>
+        </w:pBdr>
+      </w:pPr>
     </w:p>
     <w:p>
       <w:pPr>
@@ -167,17 +341,22 @@
     </w:p>
     <w:p>
       <w:r>
-        <w:t>This workforce briefing reveals a critical threat to our operational stability and future competitiveness that demands immediate CEO-level attention. The single most critical risk is the systemic failure to adequately value and retain our early-career and front-line talent, particularly within revenue-generating and foundational operational roles. With 34.9% of employees departing in their first year and an alarming 39.8% attrition among Sales Representatives, our talent pipeline is hemorrhaging at its entry points and in critical customer-facing functions. This is compounded by the fact that employees regularly working overtime, representing 28.3% of our workforce, exhibit a 30.5% attrition rate—nearly triple that of their peers. This confluence signals a fundamental disconnect in our employee value proposition, leading to unsustainable churn that directly impacts our ability to execute on current business objectives and capture future market share.</w:t>
+        <w:t>CEO,</w:t>
       </w:r>
     </w:p>
     <w:p>
       <w:r>
-        <w:t>This isn't merely an HR problem; it's a direct impediment to broader business performance and our competitive position. The overall 16.1% attrition rate translates into significant financial leakage from constant recruitment, onboarding, and lost productivity, directly eroding our profit margins. Our inability to retain new talent and core operational roles like Sales Representatives and Laboratory Technicians (23.9% attrition) means we are constantly rebuilding, diverting valuable resources from innovation and growth initiatives. Furthermore, the inverse relationship between compensation and performance—where employees with a Performance Rating of 4 earn less than those with a 3—actively disincentivizes our highest contributors, weakening our meritocratic culture and making us vulnerable to losing top talent to competitors who offer clearer pathways to reward. With 38.7% of our employees reporting low job satisfaction, our brand as an employer is at risk, impacting our ability to attract new talent in an increasingly competitive labor market.</w:t>
+        <w:t>The most pressing workforce risk demanding your immediate attention is the systemic erosion of our talent base driven by unsustainable workloads and a critical disconnect between contribution and reward. Our data unequivocally shows that employees consistently working overtime are nearly three times more likely to depart, with a 30.5% attrition rate compared to 10.4% for those not utilizing overtime. This isn't just a productivity issue; it's a foundational flaw fueling a staggering 34.9% first-year attrition, bleeding recruitment and training investments and leaving critical positions unfilled. The direct consequence is visible in our Sales department, where 20.6% overall attrition, escalating to 39.8% for Sales Representatives, directly threatens our revenue targets, market share, and client relationships. Compounding this, a 19.0% attrition within our Human Resources function, alongside its lowest job satisfaction score (2.6), compromises our capacity to address these very challenges, creating a critical organizational vulnerability. This widespread talent drain isn't merely an HR problem; it's a direct threat to our operational continuity and top-line growth.</w:t>
       </w:r>
     </w:p>
     <w:p>
       <w:r>
-        <w:t>For the Board of Directors, the message is clear: our current talent strategy poses a material risk to enterprise value and long-term shareholder return. The high attrition in critical functions, fueled by unsustainable workloads and misaligned compensation, directly compromises our capacity to meet sales targets, deliver new products, and maintain operational excellence. This threatens our growth trajectory and our ability to capitalize on market opportunities. To mitigate these risks and safeguard our future, we must make two strategic talent decisions in the next 12-18 months. First, we must launch a comprehensive overhaul of our total rewards strategy, specifically addressing the egregious pay disparities (exceeding 500% between lowest and highest paid roles) and the inverse performance-pay correlation. This means ensuring competitive base salaries for critical operational roles like Sales Representatives and Laboratory Technicians, coupled with a performance management system that genuinely recognizes and rewards high achievement. Second, we must implement a targeted retention strategy focused on early-career talent and workload management, particularly for the 28.3% of employees working significant overtime, to stem the 34.9% first-year attrition and prevent burnout, ensuring we build a stable, engaged, and productive workforce for the long term.</w:t>
+        <w:t>This pattern extends beyond immediate operational impact, fundamentally jeopardizing our broader business performance and competitive standing. The pervasive low job satisfaction reported by 38.7% of our workforce, which directly correlates with a 19.7% attrition rate for dissatisfied employees, signals a culture that is not sustainable. Furthermore, our compensation strategy actively de-motivates high performers; employees with a Performance Rating of 3 currently earn an average of $6537.0, more than the $6314.0 for our top performers rated 4. This internal inequity not only fosters disengagement but ensures we struggle to retain our most valuable contributors against external competitors who are actively seeking top talent. For the Board, this translates into a tangible erosion of shareholder value. We are facing diminished return on investment (ROI) on our human capital, a direct threat to our market leadership in critical areas like Sales, and significant reputational risk as an employer. Failure to address these systemic issues will inevitably translate into increased operational costs, hampered innovation within our 65% R&amp;D-heavy workforce, and a declining ability to execute our strategic growth initiatives.</w:t>
+      </w:r>
+    </w:p>
+    <w:p>
+      <w:r>
+        <w:t>To mitigate these risks and position ourselves for sustainable growth, two strategic talent decisions are paramount within the next 12-18 months. First, we must immediately re-engineer our Total Rewards and Workforce Planning strategy. This demands a comprehensive job evaluation and leveling exercise to address critical pay disparities – for instance, the average Sales Representative earning only $2626.0 monthly, far below the departmental average, requires urgent attention, as does the HR job role averaging only $4236.0. Concurrently, we must assess and optimize our workload distribution to alleviate the pressure driving high overtime usage and its associated attrition, rather than implicitly allowing overtime to supplement inadequate base compensation. Second, we must launch a robust Employee Experience and Leadership Development program, especially targeting our young workforce where nearly 70% are under 40. This program must focus on strengthening our onboarding processes to drastically reduce the 34.9% early-tenure attrition, enhance work-life balance (critical for R&amp;D's 2.73 score), and cultivate clear career progression pathways. These decisions are not merely HR initiatives; they are strategic investments in our organizational resilience, our capacity for innovation, and our ability to attract, retain, and motivate the talent essential for achieving our long-term business objectives and maintaining our competitive edge.</w:t>
       </w:r>
     </w:p>
     <w:sectPr>

</xml_diff>